<commit_message>
fix: update teacher resolution considerations
</commit_message>
<xml_diff>
--- a/resources/templates/resolucion_docente_reemplazo.docx
+++ b/resources/templates/resolucion_docente_reemplazo.docx
@@ -1634,138 +1634,6 @@
     </w:p>
     <w:p>
       <w:pPr>
-        <w:spacing w:after="160"/>
-        <w:ind w:firstLine="708"/>
-        <w:jc w:val="both"/>
-        <w:rPr>
-          <w:rFonts w:ascii="Century Gothic" w:hAnsi="Century Gothic"/>
-          <w:noProof/>
-          <w:sz w:val="20"/>
-          <w:szCs w:val="20"/>
-        </w:rPr>
-      </w:pPr>
-      <w:r>
-        <w:rPr>
-          <w:rFonts w:ascii="Century Gothic" w:hAnsi="Century Gothic"/>
-          <w:noProof/>
-          <w:sz w:val="20"/>
-          <w:szCs w:val="20"/>
-        </w:rPr>
-        <w:t xml:space="preserve">                                                           </w:t>
-      </w:r>
-      <w:r>
-        <w:rPr>
-          <w:rFonts w:ascii="Century Gothic" w:hAnsi="Century Gothic"/>
-          <w:b/>
-          <w:bCs/>
-          <w:noProof/>
-          <w:sz w:val="20"/>
-          <w:szCs w:val="20"/>
-        </w:rPr>
-        <w:t>6</w:t>
-      </w:r>
-      <w:r>
-        <w:rPr>
-          <w:rFonts w:ascii="Century Gothic" w:hAnsi="Century Gothic"/>
-          <w:b/>
-          <w:bCs/>
-          <w:noProof/>
-          <w:sz w:val="20"/>
-          <w:szCs w:val="20"/>
-        </w:rPr>
-        <w:t>°</w:t>
-      </w:r>
-      <w:r>
-        <w:rPr>
-          <w:rFonts w:ascii="Century Gothic" w:hAnsi="Century Gothic"/>
-          <w:noProof/>
-          <w:sz w:val="20"/>
-          <w:szCs w:val="20"/>
-        </w:rPr>
-        <w:t xml:space="preserve"> Que, </w:t>
-      </w:r>
-      <w:r>
-        <w:rPr>
-          <w:rFonts w:ascii="Century Gothic" w:eastAsia="Century Gothic" w:hAnsi="Century Gothic" w:cs="Century Gothic"/>
-          <w:noProof/>
-          <w:color w:val="000000" w:themeColor="text1"/>
-          <w:sz w:val="20"/>
-          <w:szCs w:val="20"/>
-        </w:rPr>
-        <w:t xml:space="preserve">es </w:t>
-      </w:r>
-      <w:r>
-        <w:rPr>
-          <w:rFonts w:ascii="Century Gothic" w:eastAsia="Century Gothic" w:hAnsi="Century Gothic" w:cs="Century Gothic"/>
-          <w:noProof/>
-          <w:color w:val="000000" w:themeColor="text1"/>
-          <w:sz w:val="20"/>
-          <w:szCs w:val="20"/>
-        </w:rPr>
-        <w:t xml:space="preserve">del caso indicar que, este Servicio Local de Educación Pública (SLEP) de Andalien Costa, a la fecha ya se encuentra en funcionamiento, empoderado de todas y cada una de sus obligaciones y prerrogativas, implementado todos los procesos administrativos y educacionales, </w:t>
-      </w:r>
-      <w:r>
-        <w:rPr>
-          <w:rFonts w:ascii="Century Gothic" w:eastAsia="Century Gothic" w:hAnsi="Century Gothic" w:cs="Century Gothic"/>
-          <w:noProof/>
-          <w:color w:val="000000" w:themeColor="text1"/>
-          <w:sz w:val="20"/>
-          <w:szCs w:val="20"/>
-        </w:rPr>
-        <w:t xml:space="preserve">asumiendo </w:t>
-      </w:r>
-      <w:r>
-        <w:rPr>
-          <w:rFonts w:ascii="Century Gothic" w:eastAsia="Century Gothic" w:hAnsi="Century Gothic" w:cs="Century Gothic"/>
-          <w:noProof/>
-          <w:color w:val="000000" w:themeColor="text1"/>
-          <w:sz w:val="20"/>
-          <w:szCs w:val="20"/>
-        </w:rPr>
-        <w:t xml:space="preserve">a partir del 01 de enero de 2025, como sostenedor de los establecimientos educacionales de las comunas de Lota, Coronel, San Pedro de la Paz y </w:t>
-      </w:r>
-      <w:r>
-        <w:rPr>
-          <w:rFonts w:ascii="Century Gothic" w:eastAsia="Century Gothic" w:hAnsi="Century Gothic" w:cs="Century Gothic"/>
-          <w:noProof/>
-          <w:color w:val="000000" w:themeColor="text1"/>
-          <w:sz w:val="20"/>
-          <w:szCs w:val="20"/>
-        </w:rPr>
-        <w:t>S</w:t>
-      </w:r>
-      <w:r>
-        <w:rPr>
-          <w:rFonts w:ascii="Century Gothic" w:eastAsia="Century Gothic" w:hAnsi="Century Gothic" w:cs="Century Gothic"/>
-          <w:noProof/>
-          <w:color w:val="000000" w:themeColor="text1"/>
-          <w:sz w:val="20"/>
-          <w:szCs w:val="20"/>
-        </w:rPr>
-        <w:t>anta Juana, y de tal forma proveer a través de éstos, el servicio educacional en los niveles y modalidades de correspondan, orientando se acción de conformidad a los principios de la educación pública establecidos en el artículo 5 de la Ley 21.040</w:t>
-      </w:r>
-      <w:r>
-        <w:rPr>
-          <w:rFonts w:ascii="Century Gothic" w:eastAsia="Century Gothic" w:hAnsi="Century Gothic" w:cs="Century Gothic"/>
-          <w:noProof/>
-          <w:color w:val="000000" w:themeColor="text1"/>
-          <w:sz w:val="20"/>
-          <w:szCs w:val="20"/>
-        </w:rPr>
-        <w:t>;</w:t>
-      </w:r>
-      <w:r>
-        <w:rPr>
-          <w:rFonts w:ascii="Century Gothic" w:hAnsi="Century Gothic"/>
-          <w:noProof/>
-          <w:sz w:val="20"/>
-          <w:szCs w:val="20"/>
-        </w:rPr>
-        <w:t xml:space="preserve"> </w:t>
-      </w:r>
-    </w:p>
-    <w:p>
-      <w:pPr>
         <w:tabs>
           <w:tab w:val="left" w:pos="4536"/>
         </w:tabs>
@@ -1794,7 +1662,7 @@
           <w:sz w:val="20"/>
           <w:szCs w:val="20"/>
         </w:rPr>
-        <w:t>7</w:t>
+        <w:t>6</w:t>
       </w:r>
       <w:r>
         <w:rPr>
@@ -1880,7 +1748,7 @@
           <w:sz w:val="20"/>
           <w:szCs w:val="20"/>
         </w:rPr>
-        <w:t>8</w:t>
+        <w:t>7</w:t>
       </w:r>
       <w:r>
         <w:rPr>
@@ -2002,7 +1870,7 @@
           <w:sz w:val="20"/>
           <w:szCs w:val="20"/>
         </w:rPr>
-        <w:t>9</w:t>
+        <w:t>8</w:t>
       </w:r>
       <w:r>
         <w:rPr>
@@ -2124,7 +1992,7 @@
           <w:sz w:val="20"/>
           <w:szCs w:val="20"/>
         </w:rPr>
-        <w:t>10°</w:t>
+        <w:t>9°</w:t>
       </w:r>
       <w:r>
         <w:rPr>
@@ -2356,16 +2224,16 @@
           <w:sz w:val="20"/>
           <w:szCs w:val="20"/>
         </w:rPr>
-        <w:t xml:space="preserve">                                                                     1</w:t>
-      </w:r>
-      <w:r>
-        <w:rPr>
-          <w:rFonts w:ascii="Century Gothic" w:hAnsi="Century Gothic"/>
-          <w:b/>
-          <w:sz w:val="20"/>
-          <w:szCs w:val="20"/>
-        </w:rPr>
-        <w:t>1</w:t>
+        <w:t xml:space="preserve">                                                                     10</w:t>
+      </w:r>
+      <w:r>
+        <w:rPr>
+          <w:rFonts w:ascii="Century Gothic" w:hAnsi="Century Gothic"/>
+          <w:b/>
+          <w:sz w:val="20"/>
+          <w:szCs w:val="20"/>
+        </w:rPr>
+        <w:t/>
       </w:r>
       <w:r>
         <w:rPr>
@@ -2477,17 +2345,17 @@
           <w:szCs w:val="20"/>
           <w:lang w:val="es-CL"/>
         </w:rPr>
-        <w:t>1</w:t>
-      </w:r>
-      <w:r>
-        <w:rPr>
-          <w:rFonts w:ascii="Century Gothic" w:hAnsi="Century Gothic"/>
-          <w:b/>
-          <w:sz w:val="20"/>
-          <w:szCs w:val="20"/>
-          <w:lang w:val="es-CL"/>
-        </w:rPr>
-        <w:t>2</w:t>
+        <w:t>11</w:t>
+      </w:r>
+      <w:r>
+        <w:rPr>
+          <w:rFonts w:ascii="Century Gothic" w:hAnsi="Century Gothic"/>
+          <w:b/>
+          <w:sz w:val="20"/>
+          <w:szCs w:val="20"/>
+          <w:lang w:val="es-CL"/>
+        </w:rPr>
+        <w:t/>
       </w:r>
       <w:r>
         <w:rPr>
@@ -2670,18 +2538,18 @@
           <w:lang w:val="es-CL"/>
         </w:rPr>
         <w:lastRenderedPageBreak/>
-        <w:t xml:space="preserve">                                                                        1</w:t>
-      </w:r>
-      <w:r>
-        <w:rPr>
-          <w:rFonts w:ascii="Century Gothic" w:hAnsi="Century Gothic"/>
-          <w:b/>
-          <w:bCs/>
-          <w:sz w:val="20"/>
-          <w:szCs w:val="20"/>
-          <w:lang w:val="es-CL"/>
-        </w:rPr>
-        <w:t>3</w:t>
+        <w:t xml:space="preserve">                                                                        12</w:t>
+      </w:r>
+      <w:r>
+        <w:rPr>
+          <w:rFonts w:ascii="Century Gothic" w:hAnsi="Century Gothic"/>
+          <w:b/>
+          <w:bCs/>
+          <w:sz w:val="20"/>
+          <w:szCs w:val="20"/>
+          <w:lang w:val="es-CL"/>
+        </w:rPr>
+        <w:t/>
       </w:r>
       <w:r>
         <w:rPr>
@@ -2826,17 +2694,17 @@
           <w:sz w:val="20"/>
           <w:szCs w:val="20"/>
         </w:rPr>
-        <w:t xml:space="preserve">   1</w:t>
-      </w:r>
-      <w:r>
-        <w:rPr>
-          <w:rFonts w:ascii="Century Gothic" w:hAnsi="Century Gothic"/>
-          <w:b/>
-          <w:bCs/>
-          <w:sz w:val="20"/>
-          <w:szCs w:val="20"/>
-        </w:rPr>
-        <w:t>4</w:t>
+        <w:t xml:space="preserve">   13</w:t>
+      </w:r>
+      <w:r>
+        <w:rPr>
+          <w:rFonts w:ascii="Century Gothic" w:hAnsi="Century Gothic"/>
+          <w:b/>
+          <w:bCs/>
+          <w:sz w:val="20"/>
+          <w:szCs w:val="20"/>
+        </w:rPr>
+        <w:t/>
       </w:r>
       <w:r>
         <w:rPr>
@@ -3203,17 +3071,17 @@
           <w:sz w:val="20"/>
           <w:szCs w:val="20"/>
         </w:rPr>
-        <w:t>1</w:t>
-      </w:r>
-      <w:r>
-        <w:rPr>
-          <w:rFonts w:ascii="Century Gothic" w:hAnsi="Century Gothic"/>
-          <w:b/>
-          <w:bCs/>
-          <w:sz w:val="20"/>
-          <w:szCs w:val="20"/>
-        </w:rPr>
-        <w:t>5</w:t>
+        <w:t>14</w:t>
+      </w:r>
+      <w:r>
+        <w:rPr>
+          <w:rFonts w:ascii="Century Gothic" w:hAnsi="Century Gothic"/>
+          <w:b/>
+          <w:bCs/>
+          <w:sz w:val="20"/>
+          <w:szCs w:val="20"/>
+        </w:rPr>
+        <w:t/>
       </w:r>
       <w:r>
         <w:rPr>

</xml_diff>